<commit_message>
feat: Initial check capability for DOCX files
</commit_message>
<xml_diff>
--- a/tests/fixtures/acorn.docx
+++ b/tests/fixtures/acorn.docx
@@ -13,73 +13,21 @@
     <w:p/>
     <w:p>
       <w:r>
-        <w:t>ACORN is a CLI application that provides a structure for</w:t>
+        <w:t xml:space="preserve">ACORN is a CLI application that provides a structure for Research Activity Data (RAD) and enables adding linked data context and transforming RAD into a knowledge graph that is amenable to automated reasoning and </w:t>
       </w:r>
+      <w:proofErr w:type="spellStart"/>
       <w:r>
-        <w:t xml:space="preserve"> </w:t>
+        <w:t>artifct</w:t>
       </w:r>
+      <w:proofErr w:type="spellEnd"/>
       <w:r>
-        <w:t>Research Activity Data (RAD) and enables adding linked</w:t>
-      </w:r>
-      <w:r>
-        <w:t xml:space="preserve"> </w:t>
-      </w:r>
-      <w:r>
-        <w:t>data context and transforming RAD into a knowledge graph</w:t>
-      </w:r>
-      <w:r>
-        <w:t xml:space="preserve"> </w:t>
-      </w:r>
-      <w:r>
-        <w:t xml:space="preserve">that is amenable to automated reasoning and </w:t>
-      </w:r>
-      <w:r>
-        <w:t xml:space="preserve">artifact </w:t>
-      </w:r>
-      <w:r>
-        <w:t>generation (e.g., PDF, PPTX, etc.)</w:t>
+        <w:t xml:space="preserve"> generation (e.g., PDF, PPTX, etc.)</w:t>
       </w:r>
     </w:p>
     <w:p/>
     <w:p>
       <w:r>
-        <w:t>ACORN employs a set of automated processes for informing and/or enforcing defined content schemas to create standardized and highly structured data. Because of its</w:t>
-      </w:r>
-      <w:r>
-        <w:t xml:space="preserve"> </w:t>
-      </w:r>
-      <w:r>
-        <w:t>standardized data source, ACORN easily applies computer</w:t>
-      </w:r>
-      <w:r>
-        <w:t xml:space="preserve"> </w:t>
-      </w:r>
-      <w:r>
-        <w:t>automation to generate communication assets such as PDF fact sheets,</w:t>
-      </w:r>
-      <w:r>
-        <w:t xml:space="preserve"> </w:t>
-      </w:r>
-      <w:r>
-        <w:t>PowerPoint presentations, and web pages. Built using the</w:t>
-      </w:r>
-      <w:r>
-        <w:t xml:space="preserve"> </w:t>
-      </w:r>
-      <w:r>
-        <w:t>memory-safe Rust programming language, ACORN is portable</w:t>
-      </w:r>
-      <w:r>
-        <w:t xml:space="preserve"> </w:t>
-      </w:r>
-      <w:r>
-        <w:t>and accessible for use on any Windows, Mac, or Linux</w:t>
-      </w:r>
-      <w:r>
-        <w:t xml:space="preserve"> </w:t>
-      </w:r>
-      <w:r>
-        <w:t>machine.</w:t>
+        <w:t>ACORN employs a set of automated processes for informing and/or enforcing defined content schemas to create standardized and highly structured data. Because of its standardized data source, ACORN easily applies computer automation to generate communication assets such as PDF fact sheets, PowerPoint presentations, and web pages. Built using the memory-safe Rust programming language, ACORN is portable and accessible for use on any Windows, Mac, or Linux machine.</w:t>
       </w:r>
     </w:p>
     <w:sectPr>
@@ -695,6 +643,7 @@
   <w:style w:type="character" w:default="1" w:styleId="DefaultParagraphFont">
     <w:name w:val="Default Paragraph Font"/>
     <w:uiPriority w:val="1"/>
+    <w:semiHidden/>
     <w:unhideWhenUsed/>
   </w:style>
   <w:style w:type="table" w:default="1" w:styleId="TableNormal">

</xml_diff>